<commit_message>
docs: ajusta el guion del video 4 del modulo 2 al mazo y agrega el plan del modulo 3
El guion del video 4 (dos versiones y Word) dice ahora lo que se ve en cada
diapositiva del mazo, que gano imagenes y esquemas. Se actualiza el plan
visual del video 4. Se agrega el plan del modulo 3, con los cuatro videos,
las cifras comprobadas en el codigo y las decisiones pendientes.
</commit_message>
<xml_diff>
--- a/docs/capacitacion/guion youtube/modulo-2-teoria-con-mas-detalle/video-4-datos-y-entrenamiento/modulo-2-video-4-datos-y-entrenamiento-natural.docx
+++ b/docs/capacitacion/guion youtube/modulo-2-teoria-con-mas-detalle/video-4-datos-y-entrenamiento/modulo-2-video-4-datos-y-entrenamiento-natural.docx
@@ -48,7 +48,7 @@
     </w:p>
     <w:p>
       <w:r>
-        <w:t>Todo gira alrededor de una idea. Un modelo vale lo que valen sus datos. Y lo que vale la forma de medirlo. Si las etiquetas son descuidadas, el modelo aprende el descuido. Si la prueba es débil, una cifra bonita no dice nada.</w:t>
+        <w:t>Todo gira alrededor de una idea. Un modelo vale lo que valen sus datos. Y lo que vale la forma de medirlo. Si las etiquetas son descuidadas, el modelo aprende el descuido. Si la prueba es débil, una cifra bonita no dice nada. En pantalla están las tres piezas del video, cada una con su imagen. Una foto con su contorno. La curva de la pérdida de un entrenamiento. Y las zonas en que se divide una foto para apartar la validación.</w:t>
       </w:r>
     </w:p>
     <w:p>
@@ -120,7 +120,7 @@
     </w:p>
     <w:p>
       <w:r>
-        <w:t>La pregunta que todos hacen es cuántas fotos hacen falta. La respuesta honesta es que no hay un número fijo. Depende de tres cosas.</w:t>
+        <w:t>La pregunta que todos hacen es cuántas fotos hacen falta. La respuesta honesta es que no hay un número fijo. Depende de tres cosas, que en pantalla llevan cada una su dibujo.</w:t>
       </w:r>
     </w:p>
     <w:p>
@@ -176,6 +176,11 @@
     </w:p>
     <w:p>
       <w:r>
+        <w:t>En pantalla se ve, a la izquierda, lo que propone el pre-anotador sobre un espermatozoide de la imagen de muestra: un contorno en la cabeza y unos puntos sueltos sobre la cola, que habría que borrar. A la derecha, el mismo espermatozoide con su contorno ya corregido, como un polígono de pocos vértices. Ese contorno es el que calculó el modelo y se usa aquí como ejemplo; no es un dibujo hecho en CVAT.</w:t>
+      </w:r>
+    </w:p>
+    <w:p>
+      <w:r>
         <w:t>El borrador ahorra trabajo, pero tiene un riesgo. Si se acepta sin revisar, la red aprende los errores del borrador. Corregirlo es parte del trabajo.</w:t>
       </w:r>
     </w:p>
@@ -207,12 +212,12 @@
     </w:p>
     <w:p>
       <w:r>
-        <w:t>En nuestro cuaderno, un espermatozoide se anota completo. La cabeza y el primer tramo de la cola. Eso fija lo que la red va a contornear. Y también lo que el sitio va a medir. Pero quedan casos que alguien tiene que decidir. Una mancha roja difusa y fuera de foco: ¿cuenta? Una cabeza medio tapada por una cola: ¿se dibuja? Dos cabezas pegadas: ¿un contorno o dos? Un espermatozoide cortado por el borde de la foto: ¿entra? Cada respuesta es una regla que la red aprende. Si dos personas contestan distinto, la red recibe señales que se contradicen.</w:t>
+        <w:t>En nuestro cuaderno, un espermatozoide se anota completo. La cabeza y el primer tramo de la cola. En pantalla está un ejemplo con su contorno. Eso fija lo que la red va a contornear. Y también lo que el sitio va a medir. Pero quedan casos que alguien tiene que decidir. En pantalla están dibujados cuatro. Una mancha roja difusa y fuera de foco: ¿cuenta? Una cabeza medio tapada por una cola: ¿se dibuja? Dos cabezas pegadas: ¿un contorno o dos? Un espermatozoide cortado por el borde de la foto: ¿entra? Cada respuesta es una regla que la red aprende. Si dos personas contestan distinto, la red recibe señales que se contradicen.</w:t>
       </w:r>
     </w:p>
     <w:p>
       <w:r>
-        <w:t>Por eso se recomiendan dos cosas. Un criterio escrito, de una o dos páginas, con ejemplos de cada caso. Y una persona del grupo con conocimiento biológico que valide las anotaciones. Una forma de medirlo: que dos personas anoten las mismas diez fotos, y comparar con el IoU del video 2 qué tanto coinciden. Si coinciden poco, el criterio no está claro.</w:t>
+        <w:t>Por eso se recomiendan dos cosas. Un criterio escrito, de una o dos páginas, con ejemplos de cada caso. Y una persona del grupo con conocimiento biológico que valide las anotaciones. Una forma de medirlo: que dos personas anoten las mismas diez fotos, y comparar con el IoU del video 2 qué tanto coinciden. En pantalla se ven dos contornos del mismo espermatozoide, uno de cada persona. Si coinciden poco, el criterio no está claro.</w:t>
       </w:r>
     </w:p>
     <w:p>
@@ -335,7 +340,7 @@
     </w:p>
     <w:p>
       <w:r>
-        <w:t>Cada época tarda unos 0.6 minutos. Las 60 duran alrededor de 36. Cada cinco épocas el cuaderno se detiene a validar. Si el AP50 mejora, guarda ese modelo como el mejor. Cada diez épocas guarda un archivo más grande, de unos 350 megabytes, que sirve para continuar si Colab se corta. Si pasa, basta volver a correr el cuaderno desde el principio. Retoma en la última época guardada.</w:t>
+        <w:t>Cada época tarda unos 0.6 minutos. Las 60 duran alrededor de 36. A la derecha de las cifras, en pantalla, está la salida real del cuaderno. En cada época imprime la pérdida y el tiempo acumulado, y cada cinco, la validación. Se ven la época 1, con una pérdida de 1.39. La 5, con 0.70 y un AP50 de 0.857. Y la 20, con 0.46 y un AP50 de 0.888. Cada cinco épocas el cuaderno se detiene a validar. Si el AP50 mejora, guarda ese modelo como el mejor. Cada diez épocas guarda un archivo más grande, de unos 350 megabytes, que sirve para continuar si Colab se corta. Si pasa, basta volver a correr el cuaderno desde el principio. Retoma en la última época guardada.</w:t>
       </w:r>
     </w:p>
     <w:p>
@@ -371,7 +376,7 @@
     </w:p>
     <w:p>
       <w:r>
-        <w:t>Para medir un modelo hay que decidir qué es un acierto. Usamos el IoU del video 2. Una detección es un acierto si su contorno coincide al menos el 50 por ciento con uno etiquetado. Con eso se cuentan tres cosas: los aciertos, las marcas de más y los espermatozoides que se escaparon.</w:t>
+        <w:t>Para medir un modelo hay que decidir qué es un acierto. Usamos el IoU del video 2. Una detección es un acierto si su contorno coincide al menos el 50 por ciento con uno etiquetado. Con eso se cuentan tres cosas: los aciertos, las marcas de más y los espermatozoides que se escaparon. A la derecha hay un recorte de la imagen de muestra con los tres casos, solo para verlos. Un contorno celeste sobre una cabeza es un acierto. Uno naranja sobre un filamento es una marca falsa. Y un círculo blanco rodea una cabeza que la red dejó sin contorno. Las cifras que siguen son otras: las de la validación del cuaderno.</w:t>
       </w:r>
     </w:p>
     <w:p>
@@ -417,12 +422,12 @@
     </w:p>
     <w:p>
       <w:r>
-        <w:t>Al final del entrenamiento, el cuaderno prueba varios umbrales de seguridad sobre la validación, de 0.3 a 0.9. Y calcula las medidas para cada uno. En pantalla está la tabla.</w:t>
+        <w:t>Al final del entrenamiento, el cuaderno prueba varios umbrales de seguridad sobre la validación, de 0.3 a 0.9. Y calcula las medidas para cada uno. En pantalla están la tabla y, al lado, una gráfica con las tres medidas.</w:t>
       </w:r>
     </w:p>
     <w:p>
       <w:r>
-        <w:t>Con 0.3, la red marca 79. La precisión es 0.76 y la exhaustividad, 0.91. Al subir el umbral, la precisión mejora, y la exhaustividad se mantiene en 0.91 hasta 0.7. Con 0.8 la red marca 70, con una precisión de 0.84 y una exhaustividad de 0.89. Con 0.9 marca 65, con una precisión de 0.86 y una exhaustividad de 0.85. El F1 más alto es el de 0.8, que da 0.868. Por eso el cuaderno elige ese valor.</w:t>
+        <w:t>Con 0.3, la red marca 79. La precisión es 0.76 y la exhaustividad, 0.91. Al subir el umbral, la precisión mejora, y la exhaustividad se mantiene en 0.91 hasta 0.7. Con 0.8 la red marca 70, con una precisión de 0.84 y una exhaustividad de 0.89. Con 0.9 marca 65, con una precisión de 0.86 y una exhaustividad de 0.85. El F1 más alto es el de 0.8, que da 0.868. Por eso el cuaderno elige ese valor. En la gráfica se ve que el F1 sube despacio hasta 0.8 y baja un poco con 0.9.</w:t>
       </w:r>
     </w:p>
     <w:p>
@@ -463,7 +468,7 @@
     </w:p>
     <w:p>
       <w:r>
-        <w:t>Se reconoce porque las dos medidas se separan. La pérdida de entrenamiento, que mide el error con las fotos que la red ve, sigue bajando. Pero la medida de validación, que mira fotos que no vio, deja de mejorar. O incluso empeora. Mientras las dos mejoran juntas, la red está aprendiendo. Cuando se separan, está memorizando.</w:t>
+        <w:t>En pantalla hay un esquema, no son datos nuestros: una curva celeste que sigue bajando y una naranja que sube y se aplana. Se reconoce porque las dos medidas se separan. La pérdida de entrenamiento, que mide el error con las fotos que la red ve, sigue bajando. Pero la medida de validación, que mira fotos que no vio, deja de mejorar. O incluso empeora. Mientras las dos mejoran juntas, la red está aprendiendo. Cuando se separan, está memorizando.</w:t>
       </w:r>
     </w:p>
     <w:p>
@@ -550,7 +555,7 @@
     </w:p>
     <w:p>
       <w:r>
-        <w:t>También se cuentan fotos completas. En dos fotos con pocas células, la red marcó de más: 11 donde hay 6 etiquetados, y 16 donde hay 10. En las dos fotos densas quedó cerca: 119 contra 120, y 119 contra 122. Pero esas fotos incluyen zonas con las que se entrenó, así que no prueban calidad.</w:t>
+        <w:t>También se cuentan fotos completas. En pantalla están como pares de barras: las etiquetadas y las detectadas. En dos fotos con pocas células, la red marcó de más: 11 donde hay 6 etiquetados, y 16 donde hay 10. En las dos fotos densas quedó cerca: 119 contra 120, y 119 contra 122. Pero esas fotos incluyen zonas con las que se entrenó, así que no prueban calidad.</w:t>
       </w:r>
     </w:p>
     <w:p>
@@ -581,7 +586,7 @@
     </w:p>
     <w:p>
       <w:r>
-        <w:t>¿Cómo se mejora el modelo? Casi siempre mejorando los datos, no la red. Hay cuatro pasos.</w:t>
+        <w:t>¿Cómo se mejora el modelo? Casi siempre mejorando los datos, no la red. Hay cuatro pasos, y en pantalla cada uno lleva su esquema.</w:t>
       </w:r>
     </w:p>
     <w:p>
@@ -622,7 +627,7 @@
     </w:p>
     <w:p>
       <w:r>
-        <w:t>Cerramos el módulo 2 con un resumen. En este video vimos que un dato es una foto con el contorno de cada espermatozoide. Y que no hay un número fijo de fotos: depende de la variedad y de cómo se mida. Vimos cómo se anota en CVAT, por qué el criterio es lo más delicado y cómo un borrador automático ayuda si se corrige. Vimos cómo se separan los datos y por qué, con cuatro fotos, la validación es débil. Vimos el aumento de datos, el entrenamiento en Colab, y las medidas de precisión, exhaustividad, F1 y AP50 con su ejemplo numérico. Vimos el umbral, el sobreajuste y la gráfica de curvas. Y vimos que las cifras actuales son preliminares, y que mejorar el modelo es, sobre todo, mejorar los datos.</w:t>
+        <w:t>Cerramos el módulo 2 con un resumen. Arriba, en pantalla, hay una imagen de cada uno de los cuatro videos. En este video vimos que un dato es una foto con el contorno de cada espermatozoide. Y que no hay un número fijo de fotos: depende de la variedad y de cómo se mida. Vimos cómo se anota en CVAT, por qué el criterio es lo más delicado y cómo un borrador automático ayuda si se corrige. Vimos cómo se separan los datos y por qué, con cuatro fotos, la validación es débil. Vimos el aumento de datos, el entrenamiento en Colab, y las medidas de precisión, exhaustividad, F1 y AP50 con su ejemplo numérico. Vimos el umbral, el sobreajuste y la gráfica de curvas. Y vimos que las cifras actuales son preliminares, y que mejorar el modelo es, sobre todo, mejorar los datos.</w:t>
       </w:r>
     </w:p>
     <w:p>

</xml_diff>